<commit_message>
Rework contact card: demote tagline, add health-tech register, branded email
</commit_message>
<xml_diff>
--- a/uploads/Shafaat_Choyon_Detailed_Strategic_CV 06.27.26-ea74b498.docx
+++ b/uploads/Shafaat_Choyon_Detailed_Strategic_CV 06.27.26-ea74b498.docx
@@ -5301,6 +5301,314 @@
         <w:rPr>
           <w:rtl w:val="0"/>
         </w:rPr>
+      </w:r>
+    </w:p>
+    <w:p>
+      <w:pPr>
+        <w:keepNext w:val="1"/>
+        <w:spacing w:after="50" w:before="180" w:lineRule="auto"/>
+        <w:rPr/>
+      </w:pPr>
+      <w:r>
+        <w:rPr>
+          <w:rFonts w:ascii="Arial" w:cs="Arial" w:eastAsia="Arial" w:hAnsi="Arial"/>
+          <w:b w:val="1"/>
+          <w:bCs w:val="1"/>
+          <w:color w:val="2e5496"/>
+          <w:sz w:val="22"/>
+          <w:szCs w:val="22"/>
+          <w:rtl w:val="0"/>
+        </w:rPr>
+        <w:t xml:space="preserve">Eastern Michigan University — Housing &amp; Residence Life</w:t>
+      </w:r>
+      <w:r>
+        <w:rPr>
+          <w:rtl w:val="0"/>
+        </w:rPr>
+      </w:r>
+    </w:p>
+    <w:p>
+      <w:pPr>
+        <w:keepNext w:val="1"/>
+        <w:spacing w:after="50" w:before="150" w:lineRule="auto"/>
+        <w:rPr/>
+      </w:pPr>
+      <w:r>
+        <w:rPr>
+          <w:rFonts w:ascii="Arial" w:cs="Arial" w:eastAsia="Arial" w:hAnsi="Arial"/>
+          <w:b w:val="1"/>
+          <w:bCs w:val="1"/>
+          <w:color w:val="2e5496"/>
+          <w:sz w:val="21"/>
+          <w:szCs w:val="21"/>
+          <w:rtl w:val="0"/>
+        </w:rPr>
+        <w:t xml:space="preserve">▸ </w:t>
+      </w:r>
+      <w:r>
+        <w:rPr>
+          <w:rFonts w:ascii="Arial" w:cs="Arial" w:eastAsia="Arial" w:hAnsi="Arial"/>
+          <w:b w:val="1"/>
+          <w:bCs w:val="1"/>
+          <w:color w:val="000000"/>
+          <w:sz w:val="21"/>
+          <w:szCs w:val="21"/>
+          <w:rtl w:val="0"/>
+        </w:rPr>
+        <w:t xml:space="preserve">Live-in residence-life leadership (Walton Hall, EMU)</w:t>
+      </w:r>
+      <w:r>
+        <w:rPr>
+          <w:rtl w:val="0"/>
+        </w:rPr>
+      </w:r>
+    </w:p>
+    <w:p>
+      <w:pPr>
+        <w:keepNext w:val="0"/>
+        <w:keepLines w:val="0"/>
+        <w:pageBreakBefore w:val="0"/>
+        <w:widowControl w:val="1"/>
+        <w:numPr>
+          <w:ilvl w:val="0"/>
+          <w:numId w:val="1"/>
+        </w:numPr>
+        <w:pBdr>
+          <w:top w:space="0" w:sz="0" w:val="nil"/>
+          <w:left w:space="0" w:sz="0" w:val="nil"/>
+          <w:bottom w:space="0" w:sz="0" w:val="nil"/>
+          <w:right w:space="0" w:sz="0" w:val="nil"/>
+          <w:between w:space="0" w:sz="0" w:val="nil"/>
+        </w:pBdr>
+        <w:shd w:fill="auto" w:val="clear"/>
+        <w:spacing w:after="40" w:before="0" w:line="240" w:lineRule="auto"/>
+        <w:ind w:left="360" w:right="0" w:hanging="200"/>
+        <w:jc w:val="left"/>
+        <w:rPr/>
+      </w:pPr>
+      <w:r>
+        <w:rPr>
+          <w:rFonts w:ascii="Arial" w:cs="Arial" w:eastAsia="Arial" w:hAnsi="Arial"/>
+          <w:b w:val="1"/>
+          <w:bCs w:val="1"/>
+          <w:i w:val="0"/>
+          <w:iCs w:val="0"/>
+          <w:smallCaps w:val="0"/>
+          <w:strike w:val="0"/>
+          <w:color w:val="1f3864"/>
+          <w:sz w:val="19"/>
+          <w:szCs w:val="19"/>
+          <w:u w:val="none"/>
+          <w:shd w:fill="auto" w:val="clear"/>
+          <w:vertAlign w:val="baseline"/>
+          <w:rtl w:val="0"/>
+        </w:rPr>
+        <w:t xml:space="preserve">Challenge: </w:t>
+      </w:r>
+      <w:r>
+        <w:rPr>
+          <w:rFonts w:ascii="Arial" w:cs="Arial" w:eastAsia="Arial" w:hAnsi="Arial"/>
+          <w:b w:val="0"/>
+          <w:bCs w:val="0"/>
+          <w:i w:val="0"/>
+          <w:iCs w:val="0"/>
+          <w:smallCaps w:val="0"/>
+          <w:strike w:val="0"/>
+          <w:color w:val="000000"/>
+          <w:sz w:val="19"/>
+          <w:szCs w:val="19"/>
+          <w:u w:val="none"/>
+          <w:shd w:fill="auto" w:val="clear"/>
+          <w:vertAlign w:val="baseline"/>
+          <w:rtl w:val="0"/>
+        </w:rPr>
+        <w:t xml:space="preserve">Build connection, safety, and accountability across a 230-resident hall and a nine-person, 44%-new RA team, while carrying overnight crisis response.</w:t>
+      </w:r>
+    </w:p>
+    <w:p>
+      <w:pPr>
+        <w:keepNext w:val="0"/>
+        <w:keepLines w:val="0"/>
+        <w:pageBreakBefore w:val="0"/>
+        <w:widowControl w:val="1"/>
+        <w:numPr>
+          <w:ilvl w:val="0"/>
+          <w:numId w:val="1"/>
+        </w:numPr>
+        <w:pBdr>
+          <w:top w:space="0" w:sz="0" w:val="nil"/>
+          <w:left w:space="0" w:sz="0" w:val="nil"/>
+          <w:bottom w:space="0" w:sz="0" w:val="nil"/>
+          <w:right w:space="0" w:sz="0" w:val="nil"/>
+          <w:between w:space="0" w:sz="0" w:val="nil"/>
+        </w:pBdr>
+        <w:shd w:fill="auto" w:val="clear"/>
+        <w:spacing w:after="40" w:before="0" w:line="240" w:lineRule="auto"/>
+        <w:ind w:left="360" w:right="0" w:hanging="200"/>
+        <w:jc w:val="left"/>
+        <w:rPr/>
+      </w:pPr>
+      <w:r>
+        <w:rPr>
+          <w:rFonts w:ascii="Arial" w:cs="Arial" w:eastAsia="Arial" w:hAnsi="Arial"/>
+          <w:b w:val="1"/>
+          <w:bCs w:val="1"/>
+          <w:i w:val="0"/>
+          <w:iCs w:val="0"/>
+          <w:smallCaps w:val="0"/>
+          <w:strike w:val="0"/>
+          <w:color w:val="1f3864"/>
+          <w:sz w:val="19"/>
+          <w:szCs w:val="19"/>
+          <w:u w:val="none"/>
+          <w:shd w:fill="auto" w:val="clear"/>
+          <w:vertAlign w:val="baseline"/>
+          <w:rtl w:val="0"/>
+        </w:rPr>
+        <w:t xml:space="preserve">Strategic insight: </w:t>
+      </w:r>
+      <w:r>
+        <w:rPr>
+          <w:rFonts w:ascii="Arial" w:cs="Arial" w:eastAsia="Arial" w:hAnsi="Arial"/>
+          <w:b w:val="0"/>
+          <w:bCs w:val="0"/>
+          <w:i w:val="0"/>
+          <w:iCs w:val="0"/>
+          <w:smallCaps w:val="0"/>
+          <w:strike w:val="0"/>
+          <w:color w:val="000000"/>
+          <w:sz w:val="19"/>
+          <w:szCs w:val="19"/>
+          <w:u w:val="none"/>
+          <w:shd w:fill="auto" w:val="clear"/>
+          <w:vertAlign w:val="baseline"/>
+          <w:rtl w:val="0"/>
+        </w:rPr>
+        <w:t xml:space="preserve">Lead with systems and data — an engagement model, weekly reporting, and a clear on-call chain — so a largely new team still drives measurable connection and safety.</w:t>
+      </w:r>
+    </w:p>
+    <w:p>
+      <w:pPr>
+        <w:keepNext w:val="0"/>
+        <w:keepLines w:val="0"/>
+        <w:pageBreakBefore w:val="0"/>
+        <w:widowControl w:val="1"/>
+        <w:numPr>
+          <w:ilvl w:val="0"/>
+          <w:numId w:val="1"/>
+        </w:numPr>
+        <w:pBdr>
+          <w:top w:space="0" w:sz="0" w:val="nil"/>
+          <w:left w:space="0" w:sz="0" w:val="nil"/>
+          <w:bottom w:space="0" w:sz="0" w:val="nil"/>
+          <w:right w:space="0" w:sz="0" w:val="nil"/>
+          <w:between w:space="0" w:sz="0" w:val="nil"/>
+        </w:pBdr>
+        <w:shd w:fill="auto" w:val="clear"/>
+        <w:spacing w:after="40" w:before="0" w:line="240" w:lineRule="auto"/>
+        <w:ind w:left="360" w:right="0" w:hanging="200"/>
+        <w:jc w:val="left"/>
+        <w:rPr/>
+      </w:pPr>
+      <w:r>
+        <w:rPr>
+          <w:rFonts w:ascii="Arial" w:cs="Arial" w:eastAsia="Arial" w:hAnsi="Arial"/>
+          <w:b w:val="1"/>
+          <w:bCs w:val="1"/>
+          <w:i w:val="0"/>
+          <w:iCs w:val="0"/>
+          <w:smallCaps w:val="0"/>
+          <w:strike w:val="0"/>
+          <w:color w:val="1f3864"/>
+          <w:sz w:val="19"/>
+          <w:szCs w:val="19"/>
+          <w:u w:val="none"/>
+          <w:shd w:fill="auto" w:val="clear"/>
+          <w:vertAlign w:val="baseline"/>
+          <w:rtl w:val="0"/>
+        </w:rPr>
+        <w:t xml:space="preserve">Execution: </w:t>
+      </w:r>
+      <w:r>
+        <w:rPr>
+          <w:rFonts w:ascii="Arial" w:cs="Arial" w:eastAsia="Arial" w:hAnsi="Arial"/>
+          <w:b w:val="0"/>
+          <w:bCs w:val="0"/>
+          <w:i w:val="0"/>
+          <w:iCs w:val="0"/>
+          <w:smallCaps w:val="0"/>
+          <w:strike w:val="0"/>
+          <w:color w:val="000000"/>
+          <w:sz w:val="19"/>
+          <w:szCs w:val="19"/>
+          <w:u w:val="none"/>
+          <w:shd w:fill="auto" w:val="clear"/>
+          <w:vertAlign w:val="baseline"/>
+          <w:rtl w:val="0"/>
+        </w:rPr>
+        <w:t xml:space="preserve">Designed an audience-segmentation engagement model and weekly data-informed reporting, built a structured duty-scheduling workflow, and ran on-call command across a 16-hour overnight window with DPS and Fire coordination.</w:t>
+      </w:r>
+    </w:p>
+    <w:p>
+      <w:pPr>
+        <w:keepNext w:val="0"/>
+        <w:keepLines w:val="0"/>
+        <w:pageBreakBefore w:val="0"/>
+        <w:widowControl w:val="1"/>
+        <w:numPr>
+          <w:ilvl w:val="0"/>
+          <w:numId w:val="1"/>
+        </w:numPr>
+        <w:pBdr>
+          <w:top w:space="0" w:sz="0" w:val="nil"/>
+          <w:left w:space="0" w:sz="0" w:val="nil"/>
+          <w:bottom w:space="0" w:sz="0" w:val="nil"/>
+          <w:right w:space="0" w:sz="0" w:val="nil"/>
+          <w:between w:space="0" w:sz="0" w:val="nil"/>
+        </w:pBdr>
+        <w:shd w:fill="auto" w:val="clear"/>
+        <w:spacing w:after="40" w:before="0" w:line="240" w:lineRule="auto"/>
+        <w:ind w:left="360" w:right="0" w:hanging="200"/>
+        <w:jc w:val="left"/>
+        <w:rPr/>
+      </w:pPr>
+      <w:r>
+        <w:rPr>
+          <w:rFonts w:ascii="Arial" w:cs="Arial" w:eastAsia="Arial" w:hAnsi="Arial"/>
+          <w:b w:val="1"/>
+          <w:bCs w:val="1"/>
+          <w:i w:val="0"/>
+          <w:iCs w:val="0"/>
+          <w:smallCaps w:val="0"/>
+          <w:strike w:val="0"/>
+          <w:color w:val="1f3864"/>
+          <w:sz w:val="19"/>
+          <w:szCs w:val="19"/>
+          <w:u w:val="none"/>
+          <w:shd w:fill="auto" w:val="clear"/>
+          <w:vertAlign w:val="baseline"/>
+          <w:rtl w:val="0"/>
+        </w:rPr>
+        <w:t xml:space="preserve">Result: </w:t>
+      </w:r>
+      <w:r>
+        <w:rPr>
+          <w:rFonts w:ascii="Arial" w:cs="Arial" w:eastAsia="Arial" w:hAnsi="Arial"/>
+          <w:b w:val="0"/>
+          <w:bCs w:val="0"/>
+          <w:i w:val="0"/>
+          <w:iCs w:val="0"/>
+          <w:smallCaps w:val="0"/>
+          <w:strike w:val="0"/>
+          <w:color w:val="000000"/>
+          <w:sz w:val="19"/>
+          <w:szCs w:val="19"/>
+          <w:u w:val="none"/>
+          <w:shd w:fill="auto" w:val="clear"/>
+          <w:vertAlign w:val="baseline"/>
+          <w:rtl w:val="0"/>
+        </w:rPr>
+        <w:t xml:space="preserve">541 resident engagements and the 2nd-highest campus connection rate (39.1%) among all residence halls; 156 on-call incidents resolved across 33 shifts; nominated for EMU’s Gold Medallion for Exemplary Leadership.</w:t>
       </w:r>
     </w:p>
     <w:p>

</xml_diff>